<commit_message>
applied aho corasick algorithm
</commit_message>
<xml_diff>
--- a/info/doc.docx
+++ b/info/doc.docx
@@ -2086,6 +2086,88 @@
         <w:rPr>
           <w:noProof/>
         </w:rPr>
+        <w:t>Thus, in order to create a reliable way of analyzing and generating the words, the most important thing is how the FST is designed. It should have appropiate states and transitions for managing certain rules from the language (for example, how most words in plural gain the ‘s’ prefix). All the letters from the alphabet will be considered finishing states as a word can end in any word. On top of that, special tags (&lt;pl&gt;, &lt;3sg&gt;) will be mapped as finishing states, those being at the end of the words</w:t>
+      </w:r>
+      <w:r>
+        <w:rPr>
+          <w:noProof/>
+        </w:rPr>
+        <w:t xml:space="preserve">, representing prefixes that will be mapped to certain letters, based on the </w:t>
+      </w:r>
+      <w:r>
+        <w:rPr>
+          <w:b/>
+          <w:bCs/>
+          <w:noProof/>
+        </w:rPr>
+        <w:t>context</w:t>
+      </w:r>
+      <w:r>
+        <w:rPr>
+          <w:b/>
+          <w:bCs/>
+          <w:noProof/>
+        </w:rPr>
+        <w:t xml:space="preserve">. </w:t>
+      </w:r>
+      <w:r>
+        <w:rPr>
+          <w:noProof/>
+        </w:rPr>
+        <w:t>The context is the part of the rules that is used to create the lexical form reliably. For example, a rule regarding plural words in english is that ends in ‘x’ is that ‘es’ is added, instead of just ‘s’. Thus, for this specific example, the context for this word is the letter ‘x’.</w:t>
+      </w:r>
+      <w:r>
+        <w:rPr>
+          <w:noProof/>
+        </w:rPr>
+        <w:t xml:space="preserve"> In order to not mistake when needing to transition from a normal state to another state ,or from a letter part of a context, a certain algorithm is used to map the transitions of the FST.</w:t>
+      </w:r>
+    </w:p>
+    <w:p>
+      <w:pPr>
+        <w:ind w:left="360"/>
+        <w:rPr>
+          <w:noProof/>
+        </w:rPr>
+      </w:pPr>
+      <w:r>
+        <w:rPr>
+          <w:noProof/>
+        </w:rPr>
+        <w:t xml:space="preserve">The algorithm was originally made by Aho Corasick. </w:t>
+      </w:r>
+    </w:p>
+    <w:p>
+      <w:pPr>
+        <w:ind w:left="360"/>
+        <w:rPr>
+          <w:noProof/>
+        </w:rPr>
+      </w:pPr>
+      <w:r>
+        <w:rPr>
+          <w:noProof/>
+        </w:rPr>
+        <w:t xml:space="preserve">The basic idea of the algorithm is that </w:t>
+      </w:r>
+      <w:r>
+        <w:rPr>
+          <w:noProof/>
+        </w:rPr>
+        <w:t>….</w:t>
+      </w:r>
+    </w:p>
+    <w:p>
+      <w:pPr>
+        <w:ind w:left="360"/>
+        <w:rPr>
+          <w:noProof/>
+        </w:rPr>
+      </w:pPr>
+      <w:r>
+        <w:rPr>
+          <w:noProof/>
+        </w:rPr>
         <w:tab/>
       </w:r>
       <w:r>
@@ -2102,6 +2184,12 @@
           <w:noProof/>
         </w:rPr>
       </w:pPr>
+      <w:r>
+        <w:rPr>
+          <w:noProof/>
+        </w:rPr>
+        <w:t>Aho Corasick algorithm for remembering  context and defining the transitions for the FST.</w:t>
+      </w:r>
     </w:p>
     <w:p>
       <w:pPr>
@@ -2130,6 +2218,7 @@
         <w:rPr>
           <w:noProof/>
         </w:rPr>
+        <w:lastRenderedPageBreak/>
         <w:drawing>
           <wp:inline distT="0" distB="0" distL="0" distR="0" wp14:anchorId="0124440A" wp14:editId="2BA58F15">
             <wp:extent cx="5943600" cy="1132205"/>
@@ -2620,6 +2709,7 @@
     </w:p>
     <w:p>
       <w:r>
+        <w:lastRenderedPageBreak/>
         <w:t>^chapter3-3.4,  section 8, - 8.3, , chapter 13, 13.4, no structural transfer?^)</w:t>
       </w:r>
     </w:p>

</xml_diff>

<commit_message>
improved doc about HMM and Viterbi
</commit_message>
<xml_diff>
--- a/info/doc.docx
+++ b/info/doc.docx
@@ -2543,103 +2543,363 @@
         <w:rPr>
           <w:noProof/>
         </w:rPr>
-        <w:t>Even this formula is too complicated to be computed by itself, so a simplification is applied to it in order for it to be easily computable. There appears the assumption.</w:t>
-      </w:r>
-    </w:p>
-    <w:p>
-      <w:pPr>
-        <w:rPr>
-          <w:noProof/>
-        </w:rPr>
-      </w:pPr>
-    </w:p>
-    <w:p>
-      <w:pPr>
-        <w:rPr>
-          <w:noProof/>
-        </w:rPr>
-      </w:pPr>
-    </w:p>
-    <w:p>
-      <w:pPr>
-        <w:rPr>
-          <w:noProof/>
-        </w:rPr>
-      </w:pPr>
-      <w:r>
-        <w:rPr>
-          <w:noProof/>
-        </w:rPr>
-        <w:t>-apply vertibi algorithm</w:t>
-      </w:r>
-      <w:r>
-        <w:rPr>
-          <w:noProof/>
-        </w:rPr>
-        <w:t xml:space="preserve"> -&gt; best seq of tags</w:t>
-      </w:r>
-    </w:p>
-    <w:p>
-      <w:pPr>
-        <w:rPr>
-          <w:noProof/>
-        </w:rPr>
-      </w:pPr>
-      <w:r>
-        <w:rPr>
-          <w:noProof/>
-        </w:rPr>
-        <w:t>-hmm</w:t>
-      </w:r>
-      <w:r>
-        <w:rPr>
-          <w:noProof/>
-        </w:rPr>
-        <w:t xml:space="preserve"> -&gt; model used to find the probability</w:t>
-      </w:r>
-    </w:p>
-    <w:p>
-      <w:pPr>
-        <w:rPr>
-          <w:noProof/>
-        </w:rPr>
-      </w:pPr>
-      <w:r>
-        <w:rPr>
-          <w:noProof/>
-        </w:rPr>
-        <w:t>-&gt;use sentences based on the models</w:t>
-      </w:r>
-    </w:p>
-    <w:p>
-      <w:pPr>
-        <w:rPr>
-          <w:noProof/>
-        </w:rPr>
-      </w:pPr>
-      <w:r>
-        <w:rPr>
-          <w:noProof/>
-        </w:rPr>
-        <w:t xml:space="preserve">#ultimele </w:t>
-      </w:r>
-      <w:r>
-        <w:rPr>
-          <w:noProof/>
-        </w:rPr>
-        <w:t>4</w:t>
-      </w:r>
-      <w:r>
-        <w:rPr>
-          <w:noProof/>
-        </w:rPr>
-        <w:t xml:space="preserve"> dinch</w:t>
-      </w:r>
-      <w:r>
-        <w:rPr>
-          <w:noProof/>
-        </w:rPr>
-        <w:t xml:space="preserve"> plus legat de restul, si mapat</w:t>
+        <w:t xml:space="preserve">Even this formula is too complicated to be computed by itself, so </w:t>
+      </w:r>
+      <w:r>
+        <w:rPr>
+          <w:noProof/>
+        </w:rPr>
+        <w:t>2</w:t>
+      </w:r>
+      <w:r>
+        <w:rPr>
+          <w:noProof/>
+        </w:rPr>
+        <w:t xml:space="preserve"> simplification is applied to it in order for it to be easily computable. </w:t>
+      </w:r>
+    </w:p>
+    <w:p>
+      <w:pPr>
+        <w:rPr>
+          <w:noProof/>
+        </w:rPr>
+      </w:pPr>
+      <w:r>
+        <w:rPr>
+          <w:noProof/>
+        </w:rPr>
+        <w:t xml:space="preserve">The first assumption is that a </w:t>
+      </w:r>
+      <w:r>
+        <w:rPr>
+          <w:noProof/>
+        </w:rPr>
+        <w:t>word appearing is dependent on its own tag, not on the other words around it,so thus, P(wn|tn) simplifies to: Prod[ P(wi|tn)]</w:t>
+      </w:r>
+    </w:p>
+    <w:p>
+      <w:pPr>
+        <w:rPr>
+          <w:noProof/>
+        </w:rPr>
+      </w:pPr>
+      <w:r>
+        <w:rPr>
+          <w:noProof/>
+        </w:rPr>
+        <w:t>The assumption that simplifies the equation is the following: instead of a tag depending on the other tags in the sentence, it will only depend on the previous tag (also called bigram assumption)</w:t>
+      </w:r>
+      <w:r>
+        <w:rPr>
+          <w:noProof/>
+        </w:rPr>
+        <w:t>: P(tn) =Prod [ P(ti|ti-1 ].</w:t>
+      </w:r>
+    </w:p>
+    <w:p>
+      <w:pPr>
+        <w:rPr>
+          <w:noProof/>
+        </w:rPr>
+      </w:pPr>
+      <w:r>
+        <w:rPr>
+          <w:noProof/>
+        </w:rPr>
+        <w:t>Each of the two probabilities that form the probability can be computed via the corpus:</w:t>
+      </w:r>
+    </w:p>
+    <w:p>
+      <w:pPr>
+        <w:rPr>
+          <w:noProof/>
+        </w:rPr>
+      </w:pPr>
+      <w:r>
+        <w:rPr>
+          <w:noProof/>
+        </w:rPr>
+        <w:t>The Probability P(ti-1|ti) is simplified to: C(ti-1,ti)/C(ti-1), where the nominator means how many times is tag at index I preceeded by tag at index i-1, and the denominator means how many times does tag i-1 appear in the corpus.</w:t>
+      </w:r>
+    </w:p>
+    <w:p>
+      <w:pPr>
+        <w:rPr>
+          <w:noProof/>
+        </w:rPr>
+      </w:pPr>
+      <w:r>
+        <w:rPr>
+          <w:noProof/>
+        </w:rPr>
+        <w:t xml:space="preserve">The probability P(wi|ti), that represents the fact that given a </w:t>
+      </w:r>
+      <w:r>
+        <w:rPr>
+          <w:noProof/>
+        </w:rPr>
+        <w:t>word</w:t>
+      </w:r>
+      <w:r>
+        <w:rPr>
+          <w:noProof/>
+        </w:rPr>
+        <w:t xml:space="preserve">, it is associated with </w:t>
+      </w:r>
+      <w:r>
+        <w:rPr>
+          <w:noProof/>
+        </w:rPr>
+        <w:t>a certain tag</w:t>
+      </w:r>
+      <w:r>
+        <w:rPr>
+          <w:noProof/>
+        </w:rPr>
+        <w:t xml:space="preserve"> can be computed similarly via counting with the following formula:</w:t>
+      </w:r>
+    </w:p>
+    <w:p>
+      <w:pPr>
+        <w:rPr>
+          <w:noProof/>
+        </w:rPr>
+      </w:pPr>
+      <w:r>
+        <w:rPr>
+          <w:noProof/>
+        </w:rPr>
+        <w:t>P(wi|ti) = C(ti,wi)/C(ti).</w:t>
+      </w:r>
+    </w:p>
+    <w:p>
+      <w:pPr>
+        <w:rPr>
+          <w:noProof/>
+        </w:rPr>
+      </w:pPr>
+      <w:r>
+        <w:rPr>
+          <w:noProof/>
+        </w:rPr>
+        <w:t>Now, for both probabilities we have a way to compute them.</w:t>
+      </w:r>
+    </w:p>
+    <w:p>
+      <w:pPr>
+        <w:rPr>
+          <w:noProof/>
+        </w:rPr>
+      </w:pPr>
+      <w:r>
+        <w:rPr>
+          <w:noProof/>
+        </w:rPr>
+        <w:t>The problem of choosing the best combination of tags is further narrowed down to the formal representation of a Hidden Markov Model</w:t>
+      </w:r>
+      <w:r>
+        <w:rPr>
+          <w:noProof/>
+        </w:rPr>
+        <w:t xml:space="preserve"> (HMM).</w:t>
+      </w:r>
+    </w:p>
+    <w:p>
+      <w:pPr>
+        <w:rPr>
+          <w:noProof/>
+        </w:rPr>
+      </w:pPr>
+      <w:r>
+        <w:rPr>
+          <w:noProof/>
+        </w:rPr>
+        <w:t>HMM is an extension of a finite state automata, the main difference being that each arc in between states of the automata has an associated probability, thus each edge has a weight to it of how likely it is to be taken.</w:t>
+      </w:r>
+      <w:r>
+        <w:rPr>
+          <w:noProof/>
+        </w:rPr>
+        <w:t xml:space="preserve"> From a single node, the sum of the probabilities is always 1.</w:t>
+      </w:r>
+      <w:r>
+        <w:rPr>
+          <w:noProof/>
+        </w:rPr>
+        <w:t xml:space="preserve"> In a Markov chain, the input sequence determines which states the automaton goes through.</w:t>
+      </w:r>
+      <w:r>
+        <w:rPr>
+          <w:noProof/>
+        </w:rPr>
+        <w:t xml:space="preserve"> In a HMM we have both unknown and known facts.</w:t>
+      </w:r>
+    </w:p>
+    <w:p>
+      <w:pPr>
+        <w:rPr>
+          <w:noProof/>
+        </w:rPr>
+      </w:pPr>
+      <w:r>
+        <w:rPr>
+          <w:noProof/>
+        </w:rPr>
+        <w:lastRenderedPageBreak/>
+        <w:t>In such a model, beside the states present, there is also the transition probability matrix that represents the probability of switching between the states, start and end states, emission probabilities, this being an observation (given from a vocabulary) in a state.</w:t>
+      </w:r>
+    </w:p>
+    <w:p>
+      <w:pPr>
+        <w:rPr>
+          <w:noProof/>
+        </w:rPr>
+      </w:pPr>
+      <w:r>
+        <w:rPr>
+          <w:noProof/>
+        </w:rPr>
+        <w:t>In order to find the variables in a sequence of observations, decoding must be done. One of the most common decoding algorithms was made by Viterbi.</w:t>
+      </w:r>
+    </w:p>
+    <w:p>
+      <w:pPr>
+        <w:rPr>
+          <w:noProof/>
+        </w:rPr>
+      </w:pPr>
+      <w:r>
+        <w:rPr>
+          <w:noProof/>
+        </w:rPr>
+        <w:t>The algorithm has as input</w:t>
+      </w:r>
+      <w:r>
+        <w:rPr>
+          <w:noProof/>
+        </w:rPr>
+        <w:t xml:space="preserve"> a HMM and</w:t>
+      </w:r>
+      <w:r>
+        <w:rPr>
+          <w:noProof/>
+        </w:rPr>
+        <w:t xml:space="preserve"> a set of observed words (words that need identification) and returns the most probable tag sequence for that set of words.</w:t>
+      </w:r>
+    </w:p>
+    <w:p>
+      <w:pPr>
+        <w:rPr>
+          <w:noProof/>
+        </w:rPr>
+      </w:pPr>
+      <w:r>
+        <w:rPr>
+          <w:noProof/>
+        </w:rPr>
+        <w:t>The HMM consists of two tables with probabilities: one with the hidden probabilites between the states p(ti|ti-1) and the  other with the observed probabilites, eg the association between words and tags probability: p(wi|ti).</w:t>
+      </w:r>
+    </w:p>
+    <w:p>
+      <w:pPr>
+        <w:rPr>
+          <w:noProof/>
+        </w:rPr>
+      </w:pPr>
+      <w:r>
+        <w:rPr>
+          <w:noProof/>
+        </w:rPr>
+        <w:t>The algorithm is the following:</w:t>
+      </w:r>
+    </w:p>
+    <w:p>
+      <w:pPr>
+        <w:rPr>
+          <w:noProof/>
+        </w:rPr>
+      </w:pPr>
+      <w:r>
+        <w:rPr>
+          <w:noProof/>
+        </w:rPr>
+        <w:drawing>
+          <wp:inline distT="0" distB="0" distL="0" distR="0" wp14:anchorId="171F14FA" wp14:editId="30AFDF11">
+            <wp:extent cx="5943600" cy="3286125"/>
+            <wp:effectExtent l="0" t="0" r="0" b="9525"/>
+            <wp:docPr id="1267106967" name="Picture 1"/>
+            <wp:cNvGraphicFramePr>
+              <a:graphicFrameLocks xmlns:a="http://schemas.openxmlformats.org/drawingml/2006/main" noChangeAspect="1"/>
+            </wp:cNvGraphicFramePr>
+            <a:graphic xmlns:a="http://schemas.openxmlformats.org/drawingml/2006/main">
+              <a:graphicData uri="http://schemas.openxmlformats.org/drawingml/2006/picture">
+                <pic:pic xmlns:pic="http://schemas.openxmlformats.org/drawingml/2006/picture">
+                  <pic:nvPicPr>
+                    <pic:cNvPr id="1267106967" name=""/>
+                    <pic:cNvPicPr/>
+                  </pic:nvPicPr>
+                  <pic:blipFill>
+                    <a:blip r:embed="rId11"/>
+                    <a:stretch>
+                      <a:fillRect/>
+                    </a:stretch>
+                  </pic:blipFill>
+                  <pic:spPr>
+                    <a:xfrm>
+                      <a:off x="0" y="0"/>
+                      <a:ext cx="5943600" cy="3286125"/>
+                    </a:xfrm>
+                    <a:prstGeom prst="rect">
+                      <a:avLst/>
+                    </a:prstGeom>
+                  </pic:spPr>
+                </pic:pic>
+              </a:graphicData>
+            </a:graphic>
+          </wp:inline>
+        </w:drawing>
+      </w:r>
+    </w:p>
+    <w:p>
+      <w:pPr>
+        <w:ind w:firstLine="720"/>
+        <w:rPr>
+          <w:noProof/>
+        </w:rPr>
+      </w:pPr>
+      <w:r>
+        <w:rPr>
+          <w:noProof/>
+        </w:rPr>
+        <w:t>The main idea behind an algorithm is that the best path to a point includes the path to the previous point. Thus, the algorithm works this way: for the first word, the probability of being a part of speech is computed, then for word 2, the probability of being the part of speech is dependant on the tags of word 1 and the best is chosen. That step was for a single part of speech, this is repeated for other parts of speech for word 2 and for each part of speech at word 2, a backpointer to the best previous node is computed.</w:t>
+      </w:r>
+    </w:p>
+    <w:p>
+      <w:pPr>
+        <w:ind w:firstLine="720"/>
+        <w:rPr>
+          <w:noProof/>
+        </w:rPr>
+      </w:pPr>
+      <w:r>
+        <w:rPr>
+          <w:noProof/>
+        </w:rPr>
+        <w:t>^^^^needs to be added a bit for the choosing the max, but other than that its good</w:t>
+      </w:r>
+    </w:p>
+    <w:p>
+      <w:pPr>
+        <w:rPr>
+          <w:noProof/>
+        </w:rPr>
+      </w:pPr>
+      <w:r>
+        <w:rPr>
+          <w:noProof/>
+        </w:rPr>
+        <w:lastRenderedPageBreak/>
+        <w:t>At the end, the best path along all the paths is chosen. At the final word, after looking at all the possible tags for that word, the best one is chosen and the backpointers are followed from that cell until the first word is reached and this is the final output.</w:t>
       </w:r>
     </w:p>
     <w:p>
@@ -2677,7 +2937,7 @@
                     <pic:cNvPicPr/>
                   </pic:nvPicPr>
                   <pic:blipFill>
-                    <a:blip r:embed="rId11">
+                    <a:blip r:embed="rId12">
                       <a:extLst>
                         <a:ext uri="{28A0092B-C50C-407E-A947-70E740481C1C}">
                           <a14:useLocalDpi xmlns:a14="http://schemas.microsoft.com/office/drawing/2010/main" val="0"/>
@@ -2735,7 +2995,6 @@
         <w:rPr>
           <w:noProof/>
         </w:rPr>
-        <w:lastRenderedPageBreak/>
         <w:drawing>
           <wp:inline distT="0" distB="0" distL="0" distR="0" wp14:anchorId="7B1791DC" wp14:editId="0C3BC59A">
             <wp:extent cx="5943600" cy="2111375"/>
@@ -2752,7 +3011,7 @@
                     <pic:cNvPicPr/>
                   </pic:nvPicPr>
                   <pic:blipFill>
-                    <a:blip r:embed="rId12"/>
+                    <a:blip r:embed="rId13"/>
                     <a:stretch>
                       <a:fillRect/>
                     </a:stretch>
@@ -3002,134 +3261,134 @@
           <w:noProof/>
           <w:color w:val="EE0000"/>
         </w:rPr>
+        <w:t>Angular magnification</w:t>
+      </w:r>
+      <w:r>
+        <w:rPr>
+          <w:noProof/>
+          <w:color w:val="EE0000"/>
+        </w:rPr>
+        <w:t>??? Concerned with it??? Ill see</w:t>
+      </w:r>
+    </w:p>
+    <w:p>
+      <w:pPr>
+        <w:rPr>
+          <w:noProof/>
+        </w:rPr>
+      </w:pPr>
+    </w:p>
+    <w:p>
+      <w:pPr>
+        <w:rPr>
+          <w:noProof/>
+        </w:rPr>
+      </w:pPr>
+    </w:p>
+    <w:p>
+      <w:pPr>
+        <w:rPr>
+          <w:noProof/>
+        </w:rPr>
+      </w:pPr>
+      <w:r>
+        <w:rPr>
+          <w:noProof/>
+        </w:rPr>
+        <w:t>Machine translation:</w:t>
+      </w:r>
+    </w:p>
+    <w:p>
+      <w:pPr>
+        <w:rPr>
+          <w:noProof/>
+        </w:rPr>
+      </w:pPr>
+      <w:r>
+        <w:rPr>
+          <w:noProof/>
+        </w:rPr>
+        <w:t>Lexicon, how it is modeled.</w:t>
+      </w:r>
+      <w:r>
+        <w:rPr>
+          <w:noProof/>
+        </w:rPr>
+        <w:t xml:space="preserve"> In my file</w:t>
+      </w:r>
+    </w:p>
+    <w:p>
+      <w:pPr>
+        <w:rPr>
+          <w:noProof/>
+        </w:rPr>
+      </w:pPr>
+      <w:r>
+        <w:rPr>
+          <w:noProof/>
+        </w:rPr>
+        <w:t>How did I choose the words.</w:t>
+      </w:r>
+    </w:p>
+    <w:p>
+      <w:pPr>
+        <w:rPr>
+          <w:noProof/>
+        </w:rPr>
+      </w:pPr>
+      <w:r>
+        <w:rPr>
+          <w:noProof/>
+        </w:rPr>
+        <w:t>Transducer implementation</w:t>
+      </w:r>
+    </w:p>
+    <w:p>
+      <w:pPr>
+        <w:rPr>
+          <w:noProof/>
+        </w:rPr>
+      </w:pPr>
+    </w:p>
+    <w:p>
+      <w:pPr>
+        <w:rPr>
+          <w:noProof/>
+        </w:rPr>
+      </w:pPr>
+    </w:p>
+    <w:p>
+      <w:pPr>
+        <w:rPr>
+          <w:noProof/>
+        </w:rPr>
+      </w:pPr>
+    </w:p>
+    <w:p>
+      <w:pPr>
+        <w:rPr>
+          <w:noProof/>
+        </w:rPr>
+      </w:pPr>
+    </w:p>
+    <w:p>
+      <w:pPr>
+        <w:rPr>
+          <w:noProof/>
+        </w:rPr>
+      </w:pPr>
+    </w:p>
+    <w:p>
+      <w:pPr>
+        <w:rPr>
+          <w:noProof/>
+        </w:rPr>
+      </w:pPr>
+    </w:p>
+    <w:p/>
+    <w:p>
+      <w:r>
         <w:lastRenderedPageBreak/>
-        <w:t>Angular magnification</w:t>
-      </w:r>
-      <w:r>
-        <w:rPr>
-          <w:noProof/>
-          <w:color w:val="EE0000"/>
-        </w:rPr>
-        <w:t>??? Concerned with it??? Ill see</w:t>
-      </w:r>
-    </w:p>
-    <w:p>
-      <w:pPr>
-        <w:rPr>
-          <w:noProof/>
-        </w:rPr>
-      </w:pPr>
-    </w:p>
-    <w:p>
-      <w:pPr>
-        <w:rPr>
-          <w:noProof/>
-        </w:rPr>
-      </w:pPr>
-    </w:p>
-    <w:p>
-      <w:pPr>
-        <w:rPr>
-          <w:noProof/>
-        </w:rPr>
-      </w:pPr>
-      <w:r>
-        <w:rPr>
-          <w:noProof/>
-        </w:rPr>
-        <w:t>Machine translation:</w:t>
-      </w:r>
-    </w:p>
-    <w:p>
-      <w:pPr>
-        <w:rPr>
-          <w:noProof/>
-        </w:rPr>
-      </w:pPr>
-      <w:r>
-        <w:rPr>
-          <w:noProof/>
-        </w:rPr>
-        <w:t>Lexicon, how it is modeled.</w:t>
-      </w:r>
-      <w:r>
-        <w:rPr>
-          <w:noProof/>
-        </w:rPr>
-        <w:t xml:space="preserve"> In my file</w:t>
-      </w:r>
-    </w:p>
-    <w:p>
-      <w:pPr>
-        <w:rPr>
-          <w:noProof/>
-        </w:rPr>
-      </w:pPr>
-      <w:r>
-        <w:rPr>
-          <w:noProof/>
-        </w:rPr>
-        <w:t>How did I choose the words.</w:t>
-      </w:r>
-    </w:p>
-    <w:p>
-      <w:pPr>
-        <w:rPr>
-          <w:noProof/>
-        </w:rPr>
-      </w:pPr>
-      <w:r>
-        <w:rPr>
-          <w:noProof/>
-        </w:rPr>
-        <w:t>Transducer implementation</w:t>
-      </w:r>
-    </w:p>
-    <w:p>
-      <w:pPr>
-        <w:rPr>
-          <w:noProof/>
-        </w:rPr>
-      </w:pPr>
-    </w:p>
-    <w:p>
-      <w:pPr>
-        <w:rPr>
-          <w:noProof/>
-        </w:rPr>
-      </w:pPr>
-    </w:p>
-    <w:p>
-      <w:pPr>
-        <w:rPr>
-          <w:noProof/>
-        </w:rPr>
-      </w:pPr>
-    </w:p>
-    <w:p>
-      <w:pPr>
-        <w:rPr>
-          <w:noProof/>
-        </w:rPr>
-      </w:pPr>
-    </w:p>
-    <w:p>
-      <w:pPr>
-        <w:rPr>
-          <w:noProof/>
-        </w:rPr>
-      </w:pPr>
-    </w:p>
-    <w:p>
-      <w:pPr>
-        <w:rPr>
-          <w:noProof/>
-        </w:rPr>
-      </w:pPr>
-    </w:p>
-    <w:p/>
-    <w:p>
-      <w:r>
         <w:t>References</w:t>
       </w:r>
       <w:r>
@@ -3137,7 +3396,7 @@
       </w:r>
     </w:p>
     <w:p>
-      <w:hyperlink r:id="rId13" w:history="1">
+      <w:hyperlink r:id="rId14" w:history="1">
         <w:r>
           <w:rPr>
             <w:rStyle w:val="Hyperlink"/>
@@ -3147,7 +3406,7 @@
       </w:hyperlink>
     </w:p>
     <w:p>
-      <w:hyperlink r:id="rId14" w:history="1">
+      <w:hyperlink r:id="rId15" w:history="1">
         <w:r>
           <w:rPr>
             <w:rStyle w:val="Hyperlink"/>
@@ -3157,7 +3416,7 @@
       </w:hyperlink>
     </w:p>
     <w:p>
-      <w:hyperlink r:id="rId15" w:history="1">
+      <w:hyperlink r:id="rId16" w:history="1">
         <w:r>
           <w:rPr>
             <w:rStyle w:val="Hyperlink"/>
@@ -3168,7 +3427,7 @@
     </w:p>
     <w:p/>
     <w:p>
-      <w:hyperlink r:id="rId16" w:history="1">
+      <w:hyperlink r:id="rId17" w:history="1">
         <w:r>
           <w:rPr>
             <w:rStyle w:val="Hyperlink"/>
@@ -3199,7 +3458,7 @@
     </w:p>
     <w:p/>
     <w:p>
-      <w:hyperlink r:id="rId17" w:history="1">
+      <w:hyperlink r:id="rId18" w:history="1">
         <w:r>
           <w:rPr>
             <w:rStyle w:val="Hyperlink"/>
@@ -3214,7 +3473,7 @@
       </w:r>
     </w:p>
     <w:p>
-      <w:hyperlink r:id="rId18" w:history="1">
+      <w:hyperlink r:id="rId19" w:history="1">
         <w:r>
           <w:rPr>
             <w:rStyle w:val="Hyperlink"/>
@@ -3229,7 +3488,7 @@
       </w:r>
     </w:p>
     <w:p>
-      <w:hyperlink r:id="rId19" w:history="1">
+      <w:hyperlink r:id="rId20" w:history="1">
         <w:r>
           <w:rPr>
             <w:rStyle w:val="Hyperlink"/>
@@ -3239,7 +3498,7 @@
       </w:hyperlink>
     </w:p>
     <w:p>
-      <w:hyperlink r:id="rId20" w:history="1">
+      <w:hyperlink r:id="rId21" w:history="1">
         <w:r>
           <w:rPr>
             <w:rStyle w:val="Hyperlink"/>
@@ -3262,7 +3521,7 @@
       </w:r>
     </w:p>
     <w:p>
-      <w:hyperlink r:id="rId21" w:history="1">
+      <w:hyperlink r:id="rId22" w:history="1">
         <w:r>
           <w:rPr>
             <w:rStyle w:val="Hyperlink"/>

</xml_diff>

<commit_message>
cleared documentation about Mm and HMM
started implementation of POS Tagger, need to finish doing the viterbi algorithm and then to test how it works
</commit_message>
<xml_diff>
--- a/info/doc.docx
+++ b/info/doc.docx
@@ -2701,65 +2701,238 @@
         <w:rPr>
           <w:noProof/>
         </w:rPr>
-        <w:t xml:space="preserve"> (HMM).</w:t>
-      </w:r>
-    </w:p>
-    <w:p>
-      <w:pPr>
-        <w:rPr>
-          <w:noProof/>
-        </w:rPr>
-      </w:pPr>
-      <w:r>
-        <w:rPr>
-          <w:noProof/>
-        </w:rPr>
-        <w:t>HMM is an extension of a finite state automata, the main difference being that each arc in between states of the automata has an associated probability, thus each edge has a weight to it of how likely it is to be taken.</w:t>
-      </w:r>
-      <w:r>
-        <w:rPr>
-          <w:noProof/>
-        </w:rPr>
-        <w:t xml:space="preserve"> From a single node, the sum of the probabilities is always 1.</w:t>
-      </w:r>
-      <w:r>
-        <w:rPr>
-          <w:noProof/>
-        </w:rPr>
-        <w:t xml:space="preserve"> In a Markov chain, the input sequence determines which states the automaton goes through.</w:t>
-      </w:r>
-      <w:r>
-        <w:rPr>
-          <w:noProof/>
-        </w:rPr>
-        <w:t xml:space="preserve"> In a HMM we have both unknown and known facts.</w:t>
-      </w:r>
-    </w:p>
-    <w:p>
-      <w:pPr>
-        <w:rPr>
-          <w:noProof/>
-        </w:rPr>
-      </w:pPr>
+        <w:t xml:space="preserve"> (HMM)</w:t>
+      </w:r>
+      <w:r>
+        <w:rPr>
+          <w:noProof/>
+        </w:rPr>
+        <w:t>, an extension of a Markov Chain.</w:t>
+      </w:r>
+    </w:p>
+    <w:p>
+      <w:pPr>
+        <w:rPr>
+          <w:noProof/>
+        </w:rPr>
+      </w:pPr>
+      <w:r>
+        <w:rPr>
+          <w:noProof/>
+        </w:rPr>
+        <w:t>A Markov Chain behaves like a system that moves from a state to another, where the next step only depends on current position, not on other states</w:t>
+      </w:r>
+      <w:r>
+        <w:rPr>
+          <w:noProof/>
+        </w:rPr>
+        <w:t xml:space="preserve"> and has probabilities associated with its transition arcs.</w:t>
+      </w:r>
+    </w:p>
+    <w:p>
+      <w:pPr>
+        <w:rPr>
+          <w:noProof/>
+        </w:rPr>
+      </w:pPr>
+      <w:r>
+        <w:rPr>
+          <w:noProof/>
+        </w:rPr>
+        <w:t>A Hidden Markov Model</w:t>
+      </w:r>
+      <w:r>
+        <w:rPr>
+          <w:noProof/>
+        </w:rPr>
+        <w:t xml:space="preserve"> </w:t>
+      </w:r>
+      <w:r>
+        <w:rPr>
+          <w:noProof/>
+        </w:rPr>
+        <w:t xml:space="preserve">behaves like a </w:t>
+      </w:r>
+      <w:r>
+        <w:rPr>
+          <w:noProof/>
+        </w:rPr>
+        <w:t xml:space="preserve"> finite state automata, the main difference being that each arc in between states of the automata has an associated probability, thus each edge has a weight to it of how likely it is to be taken.</w:t>
+      </w:r>
+      <w:r>
+        <w:rPr>
+          <w:noProof/>
+        </w:rPr>
+        <w:t xml:space="preserve"> From a single node, the sum of the </w:t>
+      </w:r>
       <w:r>
         <w:rPr>
           <w:noProof/>
         </w:rPr>
         <w:lastRenderedPageBreak/>
-        <w:t>In such a model, beside the states present, there is also the transition probability matrix that represents the probability of switching between the states, start and end states, emission probabilities, this being an observation (given from a vocabulary) in a state.</w:t>
-      </w:r>
-    </w:p>
-    <w:p>
-      <w:pPr>
-        <w:rPr>
-          <w:noProof/>
-        </w:rPr>
-      </w:pPr>
-      <w:r>
-        <w:rPr>
-          <w:noProof/>
-        </w:rPr>
-        <w:t>In order to find the variables in a sequence of observations, decoding must be done. One of the most common decoding algorithms was made by Viterbi.</w:t>
+        <w:t>probabilities is always 1.</w:t>
+      </w:r>
+      <w:r>
+        <w:rPr>
+          <w:noProof/>
+        </w:rPr>
+        <w:t xml:space="preserve"> In a</w:t>
+      </w:r>
+      <w:r>
+        <w:rPr>
+          <w:noProof/>
+        </w:rPr>
+        <w:t xml:space="preserve"> normal</w:t>
+      </w:r>
+      <w:r>
+        <w:rPr>
+          <w:noProof/>
+        </w:rPr>
+        <w:t xml:space="preserve"> Markov chain, the input sequence determines which states the automaton goes through</w:t>
+      </w:r>
+      <w:r>
+        <w:rPr>
+          <w:noProof/>
+        </w:rPr>
+        <w:t>,whilest in a</w:t>
+      </w:r>
+      <w:r>
+        <w:rPr>
+          <w:noProof/>
+        </w:rPr>
+        <w:t xml:space="preserve"> HMM</w:t>
+      </w:r>
+      <w:r>
+        <w:rPr>
+          <w:noProof/>
+        </w:rPr>
+        <w:t>, the states are not directly observable, only</w:t>
+      </w:r>
+      <w:r>
+        <w:rPr>
+          <w:noProof/>
+        </w:rPr>
+        <w:t xml:space="preserve"> </w:t>
+      </w:r>
+      <w:r>
+        <w:rPr>
+          <w:noProof/>
+        </w:rPr>
+        <w:t>observations about them</w:t>
+      </w:r>
+      <w:r>
+        <w:rPr>
+          <w:noProof/>
+        </w:rPr>
+        <w:t>, emitted by the hidden states while going through them.</w:t>
+      </w:r>
+    </w:p>
+    <w:p>
+      <w:pPr>
+        <w:rPr>
+          <w:noProof/>
+        </w:rPr>
+      </w:pPr>
+      <w:r>
+        <w:rPr>
+          <w:noProof/>
+        </w:rPr>
+        <w:t>Applied to part of speech tagging, the possible states are the ‘unknown’ parts of speech that form a sentence.</w:t>
+      </w:r>
+    </w:p>
+    <w:p>
+      <w:pPr>
+        <w:rPr>
+          <w:noProof/>
+        </w:rPr>
+      </w:pPr>
+      <w:r>
+        <w:rPr>
+          <w:noProof/>
+        </w:rPr>
+        <w:t>On top of the hidden states,</w:t>
+      </w:r>
+      <w:r>
+        <w:rPr>
+          <w:noProof/>
+        </w:rPr>
+        <w:t xml:space="preserve"> there is also the </w:t>
+      </w:r>
+      <w:r>
+        <w:rPr>
+          <w:i/>
+          <w:iCs/>
+          <w:noProof/>
+        </w:rPr>
+        <w:t>transition probability matrix</w:t>
+      </w:r>
+      <w:r>
+        <w:rPr>
+          <w:noProof/>
+        </w:rPr>
+        <w:t xml:space="preserve"> that represents the probability of switching between the states</w:t>
+      </w:r>
+      <w:r>
+        <w:rPr>
+          <w:noProof/>
+        </w:rPr>
+        <w:t xml:space="preserve">. An emission probability matrix is also present, which </w:t>
+      </w:r>
+      <w:r>
+        <w:rPr>
+          <w:noProof/>
+        </w:rPr>
+        <w:t>has probabilities representing the likelihood of a word being generated in a hidden state (or the probability of a word being a certain part of speech).</w:t>
+      </w:r>
+    </w:p>
+    <w:p>
+      <w:pPr>
+        <w:rPr>
+          <w:noProof/>
+        </w:rPr>
+      </w:pPr>
+      <w:r>
+        <w:rPr>
+          <w:noProof/>
+        </w:rPr>
+        <w:t>Once the two matrices are computed based on a corpus, finding the tags that represent a sentence (the best sequence of hidden states for the given sentence) is called decoding.</w:t>
+      </w:r>
+    </w:p>
+    <w:p>
+      <w:pPr>
+        <w:rPr>
+          <w:noProof/>
+        </w:rPr>
+      </w:pPr>
+      <w:r>
+        <w:rPr>
+          <w:noProof/>
+        </w:rPr>
+        <w:t xml:space="preserve">One of the most common decoding algorithms </w:t>
+      </w:r>
+      <w:r>
+        <w:rPr>
+          <w:noProof/>
+        </w:rPr>
+        <w:t>is the</w:t>
+      </w:r>
+      <w:r>
+        <w:rPr>
+          <w:noProof/>
+        </w:rPr>
+        <w:t xml:space="preserve"> Viterbi</w:t>
+      </w:r>
+      <w:r>
+        <w:rPr>
+          <w:noProof/>
+        </w:rPr>
+        <w:t xml:space="preserve"> algorithm</w:t>
+      </w:r>
+      <w:r>
+        <w:rPr>
+          <w:noProof/>
+        </w:rPr>
+        <w:t>.</w:t>
       </w:r>
     </w:p>
     <w:p>
@@ -2778,13 +2951,31 @@
         <w:rPr>
           <w:noProof/>
         </w:rPr>
-        <w:t xml:space="preserve"> a HMM and</w:t>
-      </w:r>
-      <w:r>
-        <w:rPr>
-          <w:noProof/>
-        </w:rPr>
-        <w:t xml:space="preserve"> a set of observed words (words that need identification) and returns the most probable tag sequence for that set of words.</w:t>
+        <w:t xml:space="preserve"> a HMM</w:t>
+      </w:r>
+      <w:r>
+        <w:rPr>
+          <w:noProof/>
+        </w:rPr>
+        <w:t xml:space="preserve"> </w:t>
+      </w:r>
+      <w:r>
+        <w:rPr>
+          <w:noProof/>
+        </w:rPr>
+        <w:t>and</w:t>
+      </w:r>
+      <w:r>
+        <w:rPr>
+          <w:noProof/>
+        </w:rPr>
+        <w:t xml:space="preserve"> a set of observed words (words that need identification) and returns the most probable tag sequence for that set of words</w:t>
+      </w:r>
+      <w:r>
+        <w:rPr>
+          <w:noProof/>
+        </w:rPr>
+        <w:t xml:space="preserve"> inputted.</w:t>
       </w:r>
     </w:p>
     <w:p>
@@ -2871,6 +3062,7 @@
         <w:rPr>
           <w:noProof/>
         </w:rPr>
+        <w:lastRenderedPageBreak/>
         <w:t>The main idea behind an algorithm is that the best path to a point includes the path to the previous point. Thus, the algorithm works this way: for the first word, the probability of being a part of speech is computed, then for word 2, the probability of being the part of speech is dependant on the tags of word 1 and the best is chosen. That step was for a single part of speech, this is repeated for other parts of speech for word 2 and for each part of speech at word 2, a backpointer to the best previous node is computed.</w:t>
       </w:r>
     </w:p>
@@ -2898,7 +3090,6 @@
         <w:rPr>
           <w:noProof/>
         </w:rPr>
-        <w:lastRenderedPageBreak/>
         <w:t>At the end, the best path along all the paths is chosen. At the final word, after looking at all the possible tags for that word, the best one is chosen and the backpointers are followed from that cell until the first word is reached and this is the final output.</w:t>
       </w:r>
     </w:p>
@@ -3388,7 +3579,6 @@
     <w:p/>
     <w:p>
       <w:r>
-        <w:lastRenderedPageBreak/>
         <w:t>References</w:t>
       </w:r>
       <w:r>

</xml_diff>

<commit_message>
implemented first iteration of structural parsing
</commit_message>
<xml_diff>
--- a/info/doc.docx
+++ b/info/doc.docx
@@ -2195,7 +2195,21 @@
         <w:rPr>
           <w:noProof/>
         </w:rPr>
-        <w:t xml:space="preserve">The algorithm was originally made by Aho Corasick. </w:t>
+        <w:t>The algorithm was originally made by</w:t>
+      </w:r>
+      <w:r>
+        <w:rPr>
+          <w:b/>
+          <w:bCs/>
+          <w:noProof/>
+        </w:rPr>
+        <w:t xml:space="preserve"> Aho Corasick</w:t>
+      </w:r>
+      <w:r>
+        <w:rPr>
+          <w:noProof/>
+        </w:rPr>
+        <w:t xml:space="preserve">. </w:t>
       </w:r>
     </w:p>
     <w:p>
@@ -3068,20 +3082,6 @@
     </w:p>
     <w:p>
       <w:pPr>
-        <w:ind w:firstLine="720"/>
-        <w:rPr>
-          <w:noProof/>
-        </w:rPr>
-      </w:pPr>
-      <w:r>
-        <w:rPr>
-          <w:noProof/>
-        </w:rPr>
-        <w:t>^^^^needs to be added a bit for the choosing the max, but other than that its good</w:t>
-      </w:r>
-    </w:p>
-    <w:p>
-      <w:pPr>
         <w:rPr>
           <w:noProof/>
         </w:rPr>
@@ -3095,28 +3095,474 @@
     </w:p>
     <w:p>
       <w:pPr>
-        <w:ind w:left="360"/>
-        <w:rPr>
-          <w:noProof/>
-        </w:rPr>
-      </w:pPr>
-      <w:r>
-        <w:rPr>
-          <w:noProof/>
-        </w:rPr>
+        <w:pStyle w:val="ListParagraph"/>
+        <w:numPr>
+          <w:ilvl w:val="0"/>
+          <w:numId w:val="11"/>
+        </w:numPr>
+        <w:rPr>
+          <w:noProof/>
+        </w:rPr>
+      </w:pPr>
+      <w:r>
+        <w:rPr>
+          <w:noProof/>
+        </w:rPr>
+        <w:t>Lexical and Structural Transfer</w:t>
+      </w:r>
+    </w:p>
+    <w:p>
+      <w:pPr>
+        <w:rPr>
+          <w:noProof/>
+        </w:rPr>
+      </w:pPr>
+      <w:r>
+        <w:rPr>
+          <w:noProof/>
+        </w:rPr>
+        <w:t>D1) Deep Structural Transfer</w:t>
+      </w:r>
+      <w:r>
+        <w:rPr>
+          <w:noProof/>
+        </w:rPr>
+        <w:t xml:space="preserve"> – Context Free Grammar</w:t>
+      </w:r>
+    </w:p>
+    <w:p>
+      <w:pPr>
+        <w:rPr>
+          <w:noProof/>
+        </w:rPr>
+      </w:pPr>
+      <w:r>
+        <w:rPr>
+          <w:noProof/>
+        </w:rPr>
+        <w:tab/>
+      </w:r>
+      <w:r>
+        <w:rPr>
+          <w:noProof/>
+        </w:rPr>
+        <w:t>In order to model sentence structure (in any language), one of the most common mathematical methods is the Context-Free Grammar.</w:t>
+      </w:r>
+      <w:r>
+        <w:rPr>
+          <w:noProof/>
+        </w:rPr>
+        <w:t xml:space="preserve"> One advantage of CFG’s is that it uses a set of rules baased on which the words of a language are grouped and ordered.</w:t>
+      </w:r>
+    </w:p>
+    <w:p>
+      <w:pPr>
+        <w:rPr>
+          <w:noProof/>
+        </w:rPr>
+      </w:pPr>
+      <w:r>
+        <w:rPr>
+          <w:noProof/>
+        </w:rPr>
+        <w:t>The symbols of a context free grammar are of two types: terminal and non-terminal</w:t>
+      </w:r>
+      <w:r>
+        <w:rPr>
+          <w:noProof/>
+        </w:rPr>
+        <w:t>.</w:t>
+      </w:r>
+      <w:r>
+        <w:rPr>
+          <w:noProof/>
+        </w:rPr>
+        <w:t xml:space="preserve"> Terminal words are those that have corresponding words in the targeted language (those words are part of the lexicon used in the translation process). Moreover, non-terminal symbols represent a generalisation, or group of other (terminal/non-terminal) symbols.</w:t>
+      </w:r>
+    </w:p>
+    <w:p>
+      <w:pPr>
+        <w:rPr>
+          <w:noProof/>
+        </w:rPr>
+      </w:pPr>
+      <w:r>
+        <w:rPr>
+          <w:noProof/>
+        </w:rPr>
+        <w:t>The general representation of a rule is like the following:</w:t>
+      </w:r>
+    </w:p>
+    <w:p>
+      <w:pPr>
+        <w:rPr>
+          <w:noProof/>
+        </w:rPr>
+      </w:pPr>
+      <w:r>
+        <w:rPr>
+          <w:noProof/>
+        </w:rPr>
+        <w:t>R -&gt; L | R.</w:t>
+      </w:r>
+    </w:p>
+    <w:p>
+      <w:pPr>
+        <w:rPr>
+          <w:noProof/>
+        </w:rPr>
+      </w:pPr>
+      <w:r>
+        <w:rPr>
+          <w:noProof/>
+        </w:rPr>
+        <w:t>The symbols in the left side of the arrow are always non-terminals, whilest the right side consists of either terminal or non-terminal symbols.</w:t>
+      </w:r>
+    </w:p>
+    <w:p>
+      <w:pPr>
+        <w:rPr>
+          <w:noProof/>
+        </w:rPr>
+      </w:pPr>
+      <w:r>
+        <w:rPr>
+          <w:noProof/>
+        </w:rPr>
+        <w:t xml:space="preserve"> </w:t>
+      </w:r>
+      <w:r>
+        <w:rPr>
+          <w:noProof/>
+        </w:rPr>
+        <w:t>With a CFG, one can either generate or give structure to sentences. In the given context, the purpose of the CFG will be the second one. After parsing, the sentences will be represented as parse trees.</w:t>
+      </w:r>
+    </w:p>
+    <w:p>
+      <w:pPr>
+        <w:rPr>
+          <w:noProof/>
+        </w:rPr>
+      </w:pPr>
+      <w:r>
+        <w:rPr>
+          <w:noProof/>
+        </w:rPr>
+        <w:t>All sentences will have as starting point the symbol ‘S’. Other symbols are:</w:t>
+      </w:r>
+    </w:p>
+    <w:p>
+      <w:pPr>
+        <w:rPr>
+          <w:noProof/>
+        </w:rPr>
+      </w:pPr>
+      <w:r>
+        <w:rPr>
+          <w:noProof/>
+        </w:rPr>
+        <w:t>‘NP’ -&gt;Noun Phrase, ‘VP’ -&gt; Verb Phrase, ‘PP’ -&gt; Prepositional Phrase, etc.</w:t>
+      </w:r>
+    </w:p>
+    <w:p>
+      <w:pPr>
+        <w:rPr>
+          <w:noProof/>
+        </w:rPr>
+      </w:pPr>
+      <w:r>
+        <w:rPr>
+          <w:noProof/>
+        </w:rPr>
+        <w:t>There are multiple types of sentence structures, but the ones represented in the designed CFG, will be:</w:t>
+      </w:r>
+    </w:p>
+    <w:p>
+      <w:pPr>
+        <w:rPr>
+          <w:noProof/>
+        </w:rPr>
+      </w:pPr>
+      <w:r>
+        <w:rPr>
+          <w:noProof/>
+        </w:rPr>
+        <w:t>Normal Sentences: S-&gt; NP VP</w:t>
+      </w:r>
+    </w:p>
+    <w:p>
+      <w:pPr>
+        <w:rPr>
+          <w:noProof/>
+        </w:rPr>
+      </w:pPr>
+      <w:r>
+        <w:rPr>
+          <w:noProof/>
+        </w:rPr>
+        <w:t>Imperative Sentences: S -&gt; VP</w:t>
+      </w:r>
+    </w:p>
+    <w:p>
+      <w:pPr>
+        <w:rPr>
+          <w:noProof/>
+        </w:rPr>
+      </w:pPr>
+      <w:r>
+        <w:rPr>
+          <w:noProof/>
+        </w:rPr>
+        <w:lastRenderedPageBreak/>
+        <w:t>Yes/No Questions: S -&gt; Aux NP VP, where Aux is an auxiiary verb.</w:t>
+      </w:r>
+    </w:p>
+    <w:p>
+      <w:pPr>
+        <w:rPr>
+          <w:noProof/>
+        </w:rPr>
+      </w:pPr>
+      <w:r>
+        <w:rPr>
+          <w:noProof/>
+        </w:rPr>
+        <w:t>The rules for the different kinds of phrases are:</w:t>
+      </w:r>
+    </w:p>
+    <w:p>
+      <w:pPr>
+        <w:rPr>
+          <w:noProof/>
+        </w:rPr>
+      </w:pPr>
+      <w:r>
+        <w:rPr>
+          <w:noProof/>
+        </w:rPr>
+        <w:t>NP -&gt; (Det) (Card) (Ord) (Quant) (Adj P) Nominal</w:t>
+      </w:r>
+      <w:r>
+        <w:rPr>
+          <w:noProof/>
+        </w:rPr>
+        <w:t>,  (</w:t>
+      </w:r>
+      <w:r>
+        <w:rPr>
+          <w:noProof/>
+        </w:rPr>
+        <w:t>) meaning optional.</w:t>
+      </w:r>
+    </w:p>
+    <w:p>
+      <w:pPr>
+        <w:rPr>
+          <w:noProof/>
+        </w:rPr>
+      </w:pPr>
+      <w:r>
+        <w:rPr>
+          <w:noProof/>
+        </w:rPr>
+        <w:t xml:space="preserve">Nominal -&gt; Nominal PP | </w:t>
+      </w:r>
+      <w:r>
+        <w:rPr>
+          <w:noProof/>
+        </w:rPr>
+        <w:t>NP Nominal | Nominal RelClause</w:t>
+      </w:r>
+      <w:r>
+        <w:rPr>
+          <w:noProof/>
+        </w:rPr>
+        <w:t>.</w:t>
+      </w:r>
+    </w:p>
+    <w:p>
+      <w:pPr>
+        <w:rPr>
+          <w:noProof/>
+        </w:rPr>
+      </w:pPr>
+      <w:r>
+        <w:rPr>
+          <w:noProof/>
+        </w:rPr>
+        <w:t>RelClause -&gt; (who | that) VP.</w:t>
+      </w:r>
+    </w:p>
+    <w:p>
+      <w:pPr>
+        <w:rPr>
+          <w:noProof/>
+        </w:rPr>
+      </w:pPr>
+      <w:r>
+        <w:rPr>
+          <w:noProof/>
+        </w:rPr>
+        <w:t>VP -&gt; verb</w:t>
+      </w:r>
+    </w:p>
+    <w:p>
+      <w:pPr>
+        <w:rPr>
+          <w:noProof/>
+        </w:rPr>
+      </w:pPr>
+      <w:r>
+        <w:rPr>
+          <w:noProof/>
+        </w:rPr>
+        <w:t>VP -&gt; Verb NP</w:t>
+      </w:r>
+    </w:p>
+    <w:p>
+      <w:pPr>
+        <w:rPr>
+          <w:noProof/>
+        </w:rPr>
+      </w:pPr>
+      <w:r>
+        <w:rPr>
+          <w:noProof/>
+        </w:rPr>
+        <w:t>VP -&gt; Verb NP PP</w:t>
+      </w:r>
+    </w:p>
+    <w:p>
+      <w:pPr>
+        <w:rPr>
+          <w:noProof/>
+        </w:rPr>
+      </w:pPr>
+      <w:r>
+        <w:rPr>
+          <w:noProof/>
+        </w:rPr>
+        <w:t>VP -&gt; Verb PP</w:t>
+      </w:r>
+    </w:p>
+    <w:p>
+      <w:pPr>
+        <w:rPr>
+          <w:noProof/>
+        </w:rPr>
+      </w:pPr>
+      <w:r>
+        <w:rPr>
+          <w:noProof/>
+        </w:rPr>
+        <w:t>Besides those generalizations of the main types of sentences, each sentence type has different constituents (right side terms) based on lexical information about the type of phrase. (verb type (auxiliary), transitivity of the verb, etc).</w:t>
+      </w:r>
+    </w:p>
+    <w:p>
+      <w:pPr>
+        <w:rPr>
+          <w:noProof/>
+        </w:rPr>
+      </w:pPr>
+      <w:r>
+        <w:rPr>
+          <w:noProof/>
+        </w:rPr>
+        <w:t>Besides those main types of sentences, there are the conjoined sentences that are formed with a conjunction(conj), such as and, or, etc.</w:t>
+      </w:r>
+    </w:p>
+    <w:p>
+      <w:pPr>
+        <w:rPr>
+          <w:noProof/>
+        </w:rPr>
+      </w:pPr>
+      <w:r>
+        <w:rPr>
+          <w:noProof/>
+        </w:rPr>
+        <w:t>In the implementation part, at the deep structural transfer part, a table with rules based on which sentences will be formed</w:t>
+      </w:r>
+      <w:r>
+        <w:rPr>
+          <w:noProof/>
+        </w:rPr>
+        <w:t xml:space="preserve"> will be present.</w:t>
+      </w:r>
+    </w:p>
+    <w:p>
+      <w:pPr>
+        <w:rPr>
+          <w:b/>
+          <w:bCs/>
+          <w:noProof/>
+        </w:rPr>
+      </w:pPr>
+      <w:r>
+        <w:rPr>
+          <w:b/>
+          <w:bCs/>
+          <w:noProof/>
+        </w:rPr>
+        <w:t>Parsing Sentences with CFG’s</w:t>
+      </w:r>
+    </w:p>
+    <w:p>
+      <w:pPr>
+        <w:rPr>
+          <w:noProof/>
+        </w:rPr>
+      </w:pPr>
+      <w:r>
+        <w:rPr>
+          <w:noProof/>
+        </w:rPr>
+        <w:t>Besides offering the structure of a sentence, parse trees are also an intermediary step in semantic analysis of that sentence.</w:t>
+      </w:r>
+      <w:r>
+        <w:rPr>
+          <w:noProof/>
+        </w:rPr>
+        <w:t xml:space="preserve"> In order to parse a sentence, there are two main ways of achieving the desired result: in a bottom-up manner or in a top-down manner.</w:t>
+      </w:r>
+    </w:p>
+    <w:p>
+      <w:pPr>
+        <w:rPr>
+          <w:noProof/>
+        </w:rPr>
+      </w:pPr>
+      <w:r>
+        <w:rPr>
+          <w:noProof/>
+        </w:rPr>
+        <w:t xml:space="preserve">The rules used to construct the trees are: </w:t>
+      </w:r>
+    </w:p>
+    <w:p>
+      <w:pPr>
+        <w:rPr>
+          <w:noProof/>
+        </w:rPr>
+      </w:pPr>
+      <w:r>
+        <w:rPr>
+          <w:noProof/>
+        </w:rPr>
+        <w:lastRenderedPageBreak/>
         <w:drawing>
-          <wp:anchor distT="0" distB="0" distL="114300" distR="114300" simplePos="0" relativeHeight="251662336" behindDoc="0" locked="0" layoutInCell="1" allowOverlap="1" wp14:anchorId="115EEF2C" wp14:editId="3942935C">
-            <wp:simplePos x="1143000" y="6877050"/>
+          <wp:anchor distT="0" distB="0" distL="114300" distR="114300" simplePos="0" relativeHeight="251662336" behindDoc="0" locked="0" layoutInCell="1" allowOverlap="1" wp14:anchorId="1844CB14" wp14:editId="2C602E71">
+            <wp:simplePos x="0" y="0"/>
             <wp:positionH relativeFrom="column">
-              <wp:align>left</wp:align>
+              <wp:posOffset>0</wp:posOffset>
             </wp:positionH>
             <wp:positionV relativeFrom="paragraph">
-              <wp:align>top</wp:align>
+              <wp:posOffset>0</wp:posOffset>
             </wp:positionV>
-            <wp:extent cx="1590602" cy="2209800"/>
-            <wp:effectExtent l="0" t="0" r="0" b="0"/>
-            <wp:wrapSquare wrapText="bothSides"/>
-            <wp:docPr id="315876430" name="Picture 1"/>
+            <wp:extent cx="2543530" cy="3772426"/>
+            <wp:effectExtent l="0" t="0" r="9525" b="0"/>
+            <wp:wrapTopAndBottom/>
+            <wp:docPr id="1146634187" name="Picture 1"/>
             <wp:cNvGraphicFramePr>
               <a:graphicFrameLocks xmlns:a="http://schemas.openxmlformats.org/drawingml/2006/main" noChangeAspect="1"/>
             </wp:cNvGraphicFramePr>
@@ -3124,7 +3570,7 @@
               <a:graphicData uri="http://schemas.openxmlformats.org/drawingml/2006/picture">
                 <pic:pic xmlns:pic="http://schemas.openxmlformats.org/drawingml/2006/picture">
                   <pic:nvPicPr>
-                    <pic:cNvPr id="315876430" name=""/>
+                    <pic:cNvPr id="1146634187" name=""/>
                     <pic:cNvPicPr/>
                   </pic:nvPicPr>
                   <pic:blipFill>
@@ -3142,7 +3588,7 @@
                   <pic:spPr>
                     <a:xfrm>
                       <a:off x="0" y="0"/>
-                      <a:ext cx="1590602" cy="2209800"/>
+                      <a:ext cx="2543530" cy="3772426"/>
                     </a:xfrm>
                     <a:prstGeom prst="rect">
                       <a:avLst/>
@@ -3151,29 +3597,139 @@
                 </pic:pic>
               </a:graphicData>
             </a:graphic>
+            <wp14:sizeRelH relativeFrom="page">
+              <wp14:pctWidth>0</wp14:pctWidth>
+            </wp14:sizeRelH>
+            <wp14:sizeRelV relativeFrom="page">
+              <wp14:pctHeight>0</wp14:pctHeight>
+            </wp14:sizeRelV>
           </wp:anchor>
         </w:drawing>
       </w:r>
-      <w:r>
-        <w:rPr>
-          <w:noProof/>
-        </w:rPr>
-        <w:t>&lt;&lt;&lt;used in the corpus, universal tags</w:t>
-      </w:r>
-      <w:r>
-        <w:rPr>
-          <w:noProof/>
-        </w:rPr>
-        <w:br w:type="textWrapping" w:clear="all"/>
-      </w:r>
-    </w:p>
-    <w:p>
-      <w:pPr>
-        <w:ind w:left="360"/>
-        <w:rPr>
-          <w:noProof/>
-        </w:rPr>
-      </w:pPr>
+    </w:p>
+    <w:p>
+      <w:pPr>
+        <w:rPr>
+          <w:noProof/>
+        </w:rPr>
+      </w:pPr>
+      <w:r>
+        <w:rPr>
+          <w:noProof/>
+        </w:rPr>
+        <w:t>In syntactic parsing, the parser can be viewed as searching through the space of possible trees and finding the one that can represent the given sentence.</w:t>
+      </w:r>
+    </w:p>
+    <w:p>
+      <w:pPr>
+        <w:rPr>
+          <w:noProof/>
+        </w:rPr>
+      </w:pPr>
+      <w:r>
+        <w:rPr>
+          <w:b/>
+          <w:bCs/>
+          <w:noProof/>
+        </w:rPr>
+        <w:t>A top-down parser</w:t>
+      </w:r>
+      <w:r>
+        <w:rPr>
+          <w:noProof/>
+        </w:rPr>
+        <w:t xml:space="preserve"> tries to construct the tree starting from the starting symbol ‘S’ down until leaves are reached. Thus, it looks at all trees that can be constructed given the rules in our syntactic system.</w:t>
+      </w:r>
+      <w:r>
+        <w:rPr>
+          <w:noProof/>
+        </w:rPr>
+        <w:t xml:space="preserve"> The trees are constructed by substituing the right part of each rule.</w:t>
+      </w:r>
+    </w:p>
+    <w:p>
+      <w:pPr>
+        <w:rPr>
+          <w:noProof/>
+        </w:rPr>
+      </w:pPr>
+      <w:r>
+        <w:rPr>
+          <w:b/>
+          <w:bCs/>
+          <w:noProof/>
+        </w:rPr>
+        <w:t>Bottom-up parsing</w:t>
+      </w:r>
+      <w:r>
+        <w:rPr>
+          <w:noProof/>
+        </w:rPr>
+        <w:t xml:space="preserve"> </w:t>
+      </w:r>
+      <w:r>
+        <w:rPr>
+          <w:noProof/>
+        </w:rPr>
+        <w:t>is the ‘inverse’ operation, where the parser starts with the words from the input and tries to construct the rules, up until ‘S’ is reached.</w:t>
+      </w:r>
+      <w:r>
+        <w:rPr>
+          <w:noProof/>
+        </w:rPr>
+        <w:t xml:space="preserve"> A word could be considered multiple parts of speech and that’s where bifurcation of the trees can happen.</w:t>
+      </w:r>
+    </w:p>
+    <w:p>
+      <w:pPr>
+        <w:rPr>
+          <w:noProof/>
+        </w:rPr>
+      </w:pPr>
+      <w:r>
+        <w:rPr>
+          <w:noProof/>
+        </w:rPr>
+        <w:t xml:space="preserve">When it comes to comparing the two approaches, each has it advantages and disatvantages. </w:t>
+      </w:r>
+      <w:r>
+        <w:rPr>
+          <w:noProof/>
+        </w:rPr>
+        <w:t>The top-down approach has the advantage that it does not generate trees that cannot end up in an ‘S’, since it starts with S, whilest the bottom up approach can reach those and abandons them. Contrary, the top-down approach can spend a lot of time with trees that do not fit the input sentence structure.</w:t>
+      </w:r>
+    </w:p>
+    <w:p>
+      <w:pPr>
+        <w:rPr>
+          <w:noProof/>
+        </w:rPr>
+      </w:pPr>
+      <w:r>
+        <w:rPr>
+          <w:noProof/>
+        </w:rPr>
+        <w:t>A problem that appears even in structural analysis is ambiguity. A sentence can have multiple ways of being represented. This problem, unfortunately, cannot be simply resolved with more rules added, but rather with statistical approaches.</w:t>
+      </w:r>
+      <w:r>
+        <w:rPr>
+          <w:noProof/>
+        </w:rPr>
+        <w:t xml:space="preserve"> Even in parsing, one improvement overall the accuracy and efficiency of the process involves dynamic </w:t>
+      </w:r>
+      <w:r>
+        <w:rPr>
+          <w:noProof/>
+        </w:rPr>
+        <w:lastRenderedPageBreak/>
+        <w:t>programming.</w:t>
+      </w:r>
+      <w:r>
+        <w:rPr>
+          <w:noProof/>
+        </w:rPr>
+        <w:t xml:space="preserve"> There are three widely used algorithms used in the parsing problem: CKY Algorithm, Earley algorithm and chart parsing.</w:t>
+      </w:r>
     </w:p>
     <w:p>
       <w:pPr>
@@ -3186,11 +3742,78 @@
         <w:rPr>
           <w:noProof/>
         </w:rPr>
+        <w:t>Out of all these algorithms, the chosen one to be implemented will be the Earley algorithm because it can parse any type of sentence (in contrast with CKY algorithm that needs only sentences transformed to Chomsky Normal Form). (Can talk abit here about cky…).</w:t>
+      </w:r>
+    </w:p>
+    <w:p>
+      <w:pPr>
+        <w:ind w:firstLine="720"/>
+        <w:rPr>
+          <w:noProof/>
+        </w:rPr>
+      </w:pPr>
+      <w:r>
+        <w:rPr>
+          <w:noProof/>
+        </w:rPr>
+        <w:t>The Earley Algorithm uses a top-down approach to find the structure(s) of a sentence. The main idea of the algorithm is the following</w:t>
+      </w:r>
+      <w:r>
+        <w:rPr>
+          <w:noProof/>
+        </w:rPr>
+        <w:t>:</w:t>
+      </w:r>
+      <w:r>
+        <w:rPr>
+          <w:noProof/>
+        </w:rPr>
+        <w:t xml:space="preserve"> It builds a matrix(chart) , from left to right. For each word position, a list of states that represent partial parsed trees thus far is stored in the chart.</w:t>
+      </w:r>
+      <w:r>
+        <w:rPr>
+          <w:noProof/>
+        </w:rPr>
+        <w:t xml:space="preserve"> The indexes in the chart represent the positions between the words of the sentence, so 0 is before the first word, 1 after the first word and before the secodn word and so on.</w:t>
+      </w:r>
+      <w:r>
+        <w:rPr>
+          <w:noProof/>
+        </w:rPr>
+        <w:t xml:space="preserve"> Each possible individual tree is represented once.</w:t>
+      </w:r>
+    </w:p>
+    <w:p>
+      <w:pPr>
+        <w:rPr>
+          <w:noProof/>
+        </w:rPr>
+      </w:pPr>
+      <w:r>
+        <w:rPr>
+          <w:noProof/>
+        </w:rPr>
         <w:drawing>
-          <wp:inline distT="0" distB="0" distL="0" distR="0" wp14:anchorId="7B1791DC" wp14:editId="0C3BC59A">
-            <wp:extent cx="5943600" cy="2111375"/>
-            <wp:effectExtent l="0" t="0" r="0" b="3175"/>
-            <wp:docPr id="1516279303" name="Picture 1"/>
+          <wp:anchor distT="0" distB="0" distL="114300" distR="114300" simplePos="0" relativeHeight="251663360" behindDoc="1" locked="0" layoutInCell="1" allowOverlap="1" wp14:anchorId="2E87109E" wp14:editId="2CE27778">
+            <wp:simplePos x="0" y="0"/>
+            <wp:positionH relativeFrom="margin">
+              <wp:align>left</wp:align>
+            </wp:positionH>
+            <wp:positionV relativeFrom="paragraph">
+              <wp:posOffset>410845</wp:posOffset>
+            </wp:positionV>
+            <wp:extent cx="3705225" cy="4923155"/>
+            <wp:effectExtent l="0" t="0" r="9525" b="0"/>
+            <wp:wrapTight wrapText="bothSides">
+              <wp:wrapPolygon edited="0">
+                <wp:start x="0" y="0"/>
+                <wp:lineTo x="0" y="21480"/>
+                <wp:lineTo x="21544" y="21480"/>
+                <wp:lineTo x="21544" y="0"/>
+                <wp:lineTo x="0" y="0"/>
+              </wp:wrapPolygon>
+            </wp:wrapTight>
+            <wp:docPr id="1033945583" name="Picture 1"/>
             <wp:cNvGraphicFramePr>
               <a:graphicFrameLocks xmlns:a="http://schemas.openxmlformats.org/drawingml/2006/main" noChangeAspect="1"/>
             </wp:cNvGraphicFramePr>
@@ -3198,11 +3821,17 @@
               <a:graphicData uri="http://schemas.openxmlformats.org/drawingml/2006/picture">
                 <pic:pic xmlns:pic="http://schemas.openxmlformats.org/drawingml/2006/picture">
                   <pic:nvPicPr>
-                    <pic:cNvPr id="1516279303" name=""/>
+                    <pic:cNvPr id="1033945583" name=""/>
                     <pic:cNvPicPr/>
                   </pic:nvPicPr>
                   <pic:blipFill>
-                    <a:blip r:embed="rId13"/>
+                    <a:blip r:embed="rId13">
+                      <a:extLst>
+                        <a:ext uri="{28A0092B-C50C-407E-A947-70E740481C1C}">
+                          <a14:useLocalDpi xmlns:a14="http://schemas.microsoft.com/office/drawing/2010/main" val="0"/>
+                        </a:ext>
+                      </a:extLst>
+                    </a:blip>
                     <a:stretch>
                       <a:fillRect/>
                     </a:stretch>
@@ -3210,7 +3839,7 @@
                   <pic:spPr>
                     <a:xfrm>
                       <a:off x="0" y="0"/>
-                      <a:ext cx="5943600" cy="2111375"/>
+                      <a:ext cx="3705225" cy="4923155"/>
                     </a:xfrm>
                     <a:prstGeom prst="rect">
                       <a:avLst/>
@@ -3219,81 +3848,310 @@
                 </pic:pic>
               </a:graphicData>
             </a:graphic>
-          </wp:inline>
+            <wp14:sizeRelH relativeFrom="page">
+              <wp14:pctWidth>0</wp14:pctWidth>
+            </wp14:sizeRelH>
+            <wp14:sizeRelV relativeFrom="page">
+              <wp14:pctHeight>0</wp14:pctHeight>
+            </wp14:sizeRelV>
+          </wp:anchor>
         </w:drawing>
       </w:r>
-    </w:p>
-    <w:p>
-      <w:pPr>
-        <w:rPr>
-          <w:noProof/>
-        </w:rPr>
-      </w:pPr>
-    </w:p>
-    <w:p>
-      <w:pPr>
-        <w:rPr>
-          <w:noProof/>
-        </w:rPr>
-      </w:pPr>
-      <w:r>
-        <w:rPr>
-          <w:noProof/>
-        </w:rPr>
-        <w:t>Cliticization</w:t>
-      </w:r>
-      <w:r>
-        <w:rPr>
-          <w:noProof/>
-        </w:rPr>
-        <w:t>(‘s)</w:t>
-      </w:r>
-      <w:r>
-        <w:rPr>
-          <w:noProof/>
-        </w:rPr>
-        <w:t>, derivation, english</w:t>
-      </w:r>
-    </w:p>
-    <w:p>
-      <w:pPr>
-        <w:rPr>
-          <w:noProof/>
-        </w:rPr>
-      </w:pPr>
-    </w:p>
-    <w:p>
-      <w:pPr>
-        <w:rPr>
-          <w:noProof/>
-        </w:rPr>
-      </w:pPr>
-      <w:r>
-        <w:rPr>
-          <w:noProof/>
-        </w:rPr>
-        <w:t>Stemming?</w:t>
-      </w:r>
-    </w:p>
-    <w:p>
-      <w:pPr>
-        <w:rPr>
-          <w:noProof/>
-        </w:rPr>
-      </w:pPr>
-    </w:p>
-    <w:p>
-      <w:pPr>
-        <w:rPr>
-          <w:noProof/>
-        </w:rPr>
-      </w:pPr>
-      <w:r>
-        <w:rPr>
-          <w:noProof/>
-        </w:rPr>
-        <w:t xml:space="preserve">123 250, 390(teorie gramatica), </w:t>
-      </w:r>
+      <w:r>
+        <w:rPr>
+          <w:noProof/>
+        </w:rPr>
+        <w:t>Each state that is inside a chart entry contain the following information: a subtree coresponding to a grammar rule</w:t>
+      </w:r>
+      <w:r>
+        <w:rPr>
+          <w:noProof/>
+        </w:rPr>
+        <w:t xml:space="preserve"> (a rule from a list of rules)</w:t>
+      </w:r>
+      <w:r>
+        <w:rPr>
+          <w:noProof/>
+        </w:rPr>
+        <w:t>, information about the amount of progress until the fully parsed sentence and the position of the subtree respective to the input.</w:t>
+      </w:r>
+    </w:p>
+    <w:p>
+      <w:pPr>
+        <w:rPr>
+          <w:noProof/>
+        </w:rPr>
+      </w:pPr>
+      <w:r>
+        <w:rPr>
+          <w:noProof/>
+        </w:rPr>
+        <w:t>The Earley parser applies one of three operations for each state of a chart entry</w:t>
+      </w:r>
+      <w:r>
+        <w:rPr>
+          <w:noProof/>
+        </w:rPr>
+        <w:t>, depending on its status</w:t>
+      </w:r>
+      <w:r>
+        <w:rPr>
+          <w:noProof/>
+        </w:rPr>
+        <w:t>.</w:t>
+      </w:r>
+      <w:r>
+        <w:rPr>
+          <w:noProof/>
+        </w:rPr>
+        <w:t xml:space="preserve"> Additional states can be added in the current index of the chart, or the following ones.</w:t>
+      </w:r>
+      <w:r>
+        <w:rPr>
+          <w:noProof/>
+        </w:rPr>
+        <w:t xml:space="preserve"> The algorithm never removes states and always moves forward, without backtracking.</w:t>
+      </w:r>
+    </w:p>
+    <w:p>
+      <w:pPr>
+        <w:rPr>
+          <w:noProof/>
+        </w:rPr>
+      </w:pPr>
+    </w:p>
+    <w:p>
+      <w:pPr>
+        <w:rPr>
+          <w:noProof/>
+        </w:rPr>
+      </w:pPr>
+    </w:p>
+    <w:p>
+      <w:pPr>
+        <w:rPr>
+          <w:noProof/>
+        </w:rPr>
+      </w:pPr>
+    </w:p>
+    <w:p>
+      <w:pPr>
+        <w:rPr>
+          <w:noProof/>
+        </w:rPr>
+      </w:pPr>
+    </w:p>
+    <w:p>
+      <w:pPr>
+        <w:rPr>
+          <w:noProof/>
+        </w:rPr>
+      </w:pPr>
+    </w:p>
+    <w:p>
+      <w:pPr>
+        <w:rPr>
+          <w:noProof/>
+        </w:rPr>
+      </w:pPr>
+    </w:p>
+    <w:p>
+      <w:pPr>
+        <w:rPr>
+          <w:noProof/>
+        </w:rPr>
+      </w:pPr>
+    </w:p>
+    <w:p>
+      <w:pPr>
+        <w:rPr>
+          <w:noProof/>
+        </w:rPr>
+      </w:pPr>
+      <w:r>
+        <w:rPr>
+          <w:noProof/>
+        </w:rPr>
+        <w:lastRenderedPageBreak/>
+        <w:t>The three operations part of the Earley Algorithm are: the Completer, the Scanner and Predictor operations</w:t>
+      </w:r>
+      <w:r>
+        <w:rPr>
+          <w:noProof/>
+        </w:rPr>
+        <w:t>, out of those, only the Scanner operation adding states to the next index of the chart.</w:t>
+      </w:r>
+    </w:p>
+    <w:p>
+      <w:pPr>
+        <w:rPr>
+          <w:noProof/>
+        </w:rPr>
+      </w:pPr>
+      <w:r>
+        <w:rPr>
+          <w:noProof/>
+        </w:rPr>
+        <w:t>The Predictor:</w:t>
+      </w:r>
+    </w:p>
+    <w:p>
+      <w:pPr>
+        <w:rPr>
+          <w:noProof/>
+        </w:rPr>
+      </w:pPr>
+      <w:r>
+        <w:rPr>
+          <w:noProof/>
+        </w:rPr>
+        <w:t>The Predictor is applied to all states that have a non terminal symbol right after the current index in the chart. This results in a new state for each non-terminal symbol</w:t>
+      </w:r>
+      <w:r>
+        <w:rPr>
+          <w:noProof/>
+        </w:rPr>
+        <w:t>, all placed in the current chart index.</w:t>
+      </w:r>
+    </w:p>
+    <w:p>
+      <w:pPr>
+        <w:rPr>
+          <w:noProof/>
+        </w:rPr>
+      </w:pPr>
+      <w:r>
+        <w:rPr>
+          <w:noProof/>
+        </w:rPr>
+        <w:t>The Scanner:</w:t>
+      </w:r>
+    </w:p>
+    <w:p>
+      <w:pPr>
+        <w:rPr>
+          <w:noProof/>
+        </w:rPr>
+      </w:pPr>
+      <w:r>
+        <w:rPr>
+          <w:noProof/>
+        </w:rPr>
+        <w:t>The scanner is called whenever the next iteration would contain a part of speech (terminal symbol) in order to analyze the input sentence and generate a state that contains the word and the part of speech associated to it.</w:t>
+      </w:r>
+      <w:r>
+        <w:rPr>
+          <w:noProof/>
+        </w:rPr>
+        <w:t xml:space="preserve"> Basically, a new state is created where a word is associated with a possible part of speech it could be, state which is pushed immediately after the current step being processed.</w:t>
+      </w:r>
+    </w:p>
+    <w:p>
+      <w:pPr>
+        <w:rPr>
+          <w:noProof/>
+        </w:rPr>
+      </w:pPr>
+      <w:r>
+        <w:rPr>
+          <w:noProof/>
+        </w:rPr>
+        <w:t>The Completer:</w:t>
+      </w:r>
+    </w:p>
+    <w:p>
+      <w:pPr>
+        <w:rPr>
+          <w:noProof/>
+        </w:rPr>
+      </w:pPr>
+      <w:r>
+        <w:rPr>
+          <w:noProof/>
+        </w:rPr>
+        <w:t>The completer, as the name suggests, is called whenever a rule cannot be further broken down, so a complete parse has been made on one possible structure from the ruleset.</w:t>
+      </w:r>
+    </w:p>
+    <w:p>
+      <w:pPr>
+        <w:rPr>
+          <w:noProof/>
+        </w:rPr>
+      </w:pPr>
+      <w:r>
+        <w:rPr>
+          <w:noProof/>
+        </w:rPr>
+        <w:t>Given the conventional algorithm is a recognizer, not a parser, one modification is done to the algorithm: the completer function is modified, a pointer to a previous state is added, then finding the parse tree is simply following back the pointers back to the start.</w:t>
+      </w:r>
+    </w:p>
+    <w:p>
+      <w:pPr>
+        <w:rPr>
+          <w:noProof/>
+        </w:rPr>
+      </w:pPr>
+    </w:p>
+    <w:p>
+      <w:pPr>
+        <w:rPr>
+          <w:noProof/>
+        </w:rPr>
+      </w:pPr>
+      <w:r>
+        <w:rPr>
+          <w:noProof/>
+        </w:rPr>
+        <w:t>D2) Shallow/Chunk Lexical/Structural Transfer</w:t>
+      </w:r>
+      <w:r>
+        <w:rPr>
+          <w:noProof/>
+        </w:rPr>
+        <w:t xml:space="preserve"> (Partial Parsing) 455</w:t>
+      </w:r>
+      <w:r>
+        <w:rPr>
+          <w:noProof/>
+        </w:rPr>
+        <w:t xml:space="preserve"> SpeechLangProcessing</w:t>
+      </w:r>
+      <w:r>
+        <w:rPr>
+          <w:noProof/>
+        </w:rPr>
+        <w:br w:type="textWrapping" w:clear="all"/>
+      </w:r>
+    </w:p>
+    <w:p>
+      <w:pPr>
+        <w:ind w:left="360"/>
+        <w:rPr>
+          <w:noProof/>
+        </w:rPr>
+      </w:pPr>
+    </w:p>
+    <w:p>
+      <w:pPr>
+        <w:ind w:firstLine="720"/>
+        <w:rPr>
+          <w:noProof/>
+        </w:rPr>
+      </w:pPr>
+    </w:p>
+    <w:p>
+      <w:pPr>
+        <w:rPr>
+          <w:noProof/>
+        </w:rPr>
+      </w:pPr>
+    </w:p>
+    <w:p>
+      <w:pPr>
+        <w:rPr>
+          <w:noProof/>
+        </w:rPr>
+      </w:pPr>
       <w:r>
         <w:rPr>
           <w:noProof/>
@@ -3375,6 +4233,11 @@
     </w:p>
     <w:p>
       <w:pPr>
+        <w:pStyle w:val="ListParagraph"/>
+        <w:numPr>
+          <w:ilvl w:val="0"/>
+          <w:numId w:val="8"/>
+        </w:numPr>
         <w:rPr>
           <w:b/>
           <w:bCs/>
@@ -3397,6 +4260,27 @@
     <w:p>
       <w:pPr>
         <w:rPr>
+          <w:b/>
+          <w:bCs/>
+          <w:noProof/>
+          <w:sz w:val="28"/>
+          <w:szCs w:val="28"/>
+        </w:rPr>
+      </w:pPr>
+      <w:r>
+        <w:rPr>
+          <w:b/>
+          <w:bCs/>
+          <w:noProof/>
+          <w:sz w:val="28"/>
+          <w:szCs w:val="28"/>
+        </w:rPr>
+        <w:t>Optical part</w:t>
+      </w:r>
+    </w:p>
+    <w:p>
+      <w:pPr>
+        <w:rPr>
           <w:noProof/>
         </w:rPr>
       </w:pPr>
@@ -3465,25 +4349,15 @@
     <w:p>
       <w:pPr>
         <w:rPr>
-          <w:noProof/>
-        </w:rPr>
-      </w:pPr>
-    </w:p>
-    <w:p>
-      <w:pPr>
-        <w:rPr>
-          <w:noProof/>
-        </w:rPr>
-      </w:pPr>
-    </w:p>
-    <w:p>
-      <w:pPr>
-        <w:rPr>
-          <w:noProof/>
-        </w:rPr>
-      </w:pPr>
-      <w:r>
-        <w:rPr>
+          <w:b/>
+          <w:bCs/>
+          <w:noProof/>
+        </w:rPr>
+      </w:pPr>
+      <w:r>
+        <w:rPr>
+          <w:b/>
+          <w:bCs/>
           <w:noProof/>
         </w:rPr>
         <w:t>Machine translation:</w:t>
@@ -3576,12 +4450,86 @@
         </w:rPr>
       </w:pPr>
     </w:p>
-    <w:p/>
-    <w:p>
-      <w:r>
+    <w:p>
+      <w:pPr>
+        <w:rPr>
+          <w:b/>
+          <w:bCs/>
+          <w:sz w:val="32"/>
+          <w:szCs w:val="32"/>
+        </w:rPr>
+      </w:pPr>
+    </w:p>
+    <w:p>
+      <w:pPr>
+        <w:rPr>
+          <w:b/>
+          <w:bCs/>
+          <w:sz w:val="32"/>
+          <w:szCs w:val="32"/>
+        </w:rPr>
+      </w:pPr>
+    </w:p>
+    <w:p>
+      <w:pPr>
+        <w:rPr>
+          <w:b/>
+          <w:bCs/>
+          <w:sz w:val="32"/>
+          <w:szCs w:val="32"/>
+        </w:rPr>
+      </w:pPr>
+    </w:p>
+    <w:p>
+      <w:pPr>
+        <w:rPr>
+          <w:b/>
+          <w:bCs/>
+          <w:sz w:val="32"/>
+          <w:szCs w:val="32"/>
+        </w:rPr>
+      </w:pPr>
+    </w:p>
+    <w:p>
+      <w:pPr>
+        <w:rPr>
+          <w:b/>
+          <w:bCs/>
+          <w:sz w:val="32"/>
+          <w:szCs w:val="32"/>
+        </w:rPr>
+      </w:pPr>
+    </w:p>
+    <w:p>
+      <w:pPr>
+        <w:pStyle w:val="ListParagraph"/>
+        <w:numPr>
+          <w:ilvl w:val="0"/>
+          <w:numId w:val="8"/>
+        </w:numPr>
+        <w:rPr>
+          <w:b/>
+          <w:bCs/>
+          <w:sz w:val="32"/>
+          <w:szCs w:val="32"/>
+        </w:rPr>
+      </w:pPr>
+      <w:r>
+        <w:rPr>
+          <w:b/>
+          <w:bCs/>
+          <w:sz w:val="32"/>
+          <w:szCs w:val="32"/>
+        </w:rPr>
         <w:t>References</w:t>
       </w:r>
       <w:r>
+        <w:rPr>
+          <w:b/>
+          <w:bCs/>
+          <w:sz w:val="32"/>
+          <w:szCs w:val="32"/>
+        </w:rPr>
         <w:t>:</w:t>
       </w:r>
     </w:p>
@@ -3643,7 +4591,7 @@
     </w:p>
     <w:p>
       <w:r>
-        <w:t>^chapter3-3.4,  section 8, - 8.3, , chapter 13, 13.4, no structural transfer?^)</w:t>
+        <w:t xml:space="preserve">^chapter3-3.4,  section 8, - 8.3, , chapter 13, 13.4, </w:t>
       </w:r>
     </w:p>
     <w:p/>

</xml_diff>